<commit_message>
Add client name Oshodi-Tapa Agboola; refresh Word downloads
Co-Authored-By: Claude Fable 5 <noreply@anthropic.com>
</commit_message>
<xml_diff>
--- a/downloads/Lentopay-Development-Proposal-SOW.docx
+++ b/downloads/Lentopay-Development-Proposal-SOW.docx
@@ -69,7 +69,7 @@
         <w:t xml:space="preserve">Prepared for: </w:t>
       </w:r>
       <w:r>
-        <w:t xml:space="preserve">[Client Name] — Lentopay</w:t>
+        <w:t xml:space="preserve">Oshodi-Tapa Agboola — Lentopay</w:t>
       </w:r>
     </w:p>
     <w:p>
@@ -475,7 +475,7 @@
         <w:spacing w:after="160" w:before="0"/>
       </w:pPr>
       <w:r>
-        <w:t xml:space="preserve">Dear [Client Name],</w:t>
+        <w:t xml:space="preserve">Dear Oshodi-Tapa Agboola,</w:t>
       </w:r>
     </w:p>
     <w:p>
@@ -8358,7 +8358,7 @@
           <w:b/>
           <w:bCs/>
         </w:rPr>
-        <w:t xml:space="preserve">For the Client — [Client Name]</w:t>
+        <w:t xml:space="preserve">For the Client — Oshodi-Tapa Agboola</w:t>
       </w:r>
     </w:p>
     <w:p>
@@ -8433,7 +8433,7 @@
           <w:sz w:val="18"/>
           <w:szCs w:val="18"/>
         </w:rPr>
-        <w:t xml:space="preserve">Confidential. Prepared by [Developer Name/Studio] for [Client Name]. © 2026. Regulatory and market figures derive from the accompanying Market &amp; Regulatory Strategy Report and should be re-verified with counsel before filings.</w:t>
+        <w:t xml:space="preserve">Confidential. Prepared by [Developer Name/Studio] for Oshodi-Tapa Agboola. © 2026. Regulatory and market figures derive from the accompanying Market &amp; Regulatory Strategy Report and should be re-verified with counsel before filings.</w:t>
       </w:r>
     </w:p>
     <w:sectPr>

</xml_diff>

<commit_message>
Replace all em/en-dashes with plain hyphens across site and downloads
Co-Authored-By: Claude Fable 5 <noreply@anthropic.com>
</commit_message>
<xml_diff>
--- a/downloads/Lentopay-Development-Proposal-SOW.docx
+++ b/downloads/Lentopay-Development-Proposal-SOW.docx
@@ -53,7 +53,7 @@
           <w:sz w:val="32"/>
           <w:szCs w:val="32"/>
         </w:rPr>
-        <w:t xml:space="preserve">Development Proposal &amp; Statement of Work — v1.0</w:t>
+        <w:t xml:space="preserve">Development Proposal &amp; Statement of Work - v1.0</w:t>
       </w:r>
     </w:p>
     <w:p>
@@ -69,7 +69,7 @@
         <w:t xml:space="preserve">Prepared for: </w:t>
       </w:r>
       <w:r>
-        <w:t xml:space="preserve">Oshodi-Tapa Agboola — Lentopay</w:t>
+        <w:t xml:space="preserve">Oshodi-Tapa Agboola - Lentopay</w:t>
       </w:r>
     </w:p>
     <w:p>
@@ -417,7 +417,7 @@
           <w:iCs/>
           <w:color w:val="666A7A"/>
         </w:rPr>
-        <w:t xml:space="preserve">Confidential — for the addressee only.</w:t>
+        <w:t xml:space="preserve">Confidential - for the addressee only.</w:t>
       </w:r>
     </w:p>
     <w:p>
@@ -483,7 +483,7 @@
         <w:spacing w:after="160" w:before="0"/>
       </w:pPr>
       <w:r>
-        <w:t xml:space="preserve">Thank you for sharing your PRD for the Lentopay crypto exchange platform. We have read it closely — and then we went further. Over the discovery period we researched the Nigerian crypto market, its regulators, its competitors and its failures, and we rebuilt your requirements into a delivery plan that can actually launch in today's Nigeria: SEC-licensed, bank-connected, and trusted by users who have been burned before.</w:t>
+        <w:t xml:space="preserve">Thank you for sharing your PRD for the Lentopay crypto exchange platform. We have read it closely - and then we went further. Over the discovery period we researched the Nigerian crypto market, its regulators, its competitors and its failures, and we rebuilt your requirements into a delivery plan that can actually launch in today's Nigeria: SEC-licensed, bank-connected, and trusted by users who have been burned before.</w:t>
       </w:r>
     </w:p>
     <w:p>
@@ -491,7 +491,7 @@
         <w:spacing w:after="160" w:before="0"/>
       </w:pPr>
       <w:r>
-        <w:t xml:space="preserve">The opportunity is real. Nigeria received $92 billion in on-chain value in the twelve months to June 2025, roughly 22 million Nigerians hold crypto, and — since Yellow Card exited retail and Binance lost its naira rails — no licensed player offers the bundle you have specified: crypto trading, bill payments, gift cards and savings in one app. The constraint is equally real: since the Investments and Securities Act 2025, every one of your ten features has a regulatory gate, and some gates open later than others.</w:t>
+        <w:t xml:space="preserve">The opportunity is real. Nigeria received $92 billion in on-chain value in the twelve months to June 2025, roughly 22 million Nigerians hold crypto, and - since Yellow Card exited retail and Binance lost its naira rails - no licensed player offers the bundle you have specified: crypto trading, bill payments, gift cards and savings in one app. The constraint is equally real: since the Investments and Securities Act 2025, every one of your ten features has a regulatory gate, and some gates open later than others.</w:t>
       </w:r>
     </w:p>
     <w:p>
@@ -499,7 +499,7 @@
         <w:spacing w:after="160" w:before="0"/>
       </w:pPr>
       <w:r>
-        <w:t xml:space="preserve">Our proposal therefore does one thing differently from a conventional build plan: it sequences delivery around those gates, so you are always shipping the most valuable product that is legal to operate at that moment. We build the exchange core first, on rails that exist and partners that will bank you; we stage savings and E-Fund behind the approvals they require; and we bake compliance — FIRS reporting, AML monitoring, tiered KYC — into the ledger from day one rather than retrofitting it under enforcement pressure.</w:t>
+        <w:t xml:space="preserve">Our proposal therefore does one thing differently from a conventional build plan: it sequences delivery around those gates, so you are always shipping the most valuable product that is legal to operate at that moment. We build the exchange core first, on rails that exist and partners that will bank you; we stage savings and E-Fund behind the approvals they require; and we bake compliance - FIRS reporting, AML monitoring, tiered KYC - into the ledger from day one rather than retrofitting it under enforcement pressure.</w:t>
       </w:r>
     </w:p>
     <w:p>
@@ -554,7 +554,7 @@
         <w:spacing w:after="160" w:before="0"/>
       </w:pPr>
       <w:r>
-        <w:t xml:space="preserve">Our market research confirms the thesis and sharpens it. The Nigerian market is stablecoin-shaped — USDT/USDC dominate because they hedge naira devaluation — so the product should quote and settle around stablecoins, with BTC/ETH secondary. The competitive gap is precisely your bundle: licensed exchanges (Busha, Quidax, Luno) do not do bills or gift cards; gift card apps (Cardtonic, Prestmit) do shallow crypto without licenses; and roughly 90% of volume sits with unlicensed offshore platforms whose users have no naira rails and no recourse. The battleground is trust: withdrawal reliability, proof-of-reserves, real support. The regulatory reality is that ISA 2025 makes digital assets securities, the SEC's ARIP program is the licensing path, CBN rules mean no SEC license = no bank account, and savings/E-Fund each require approvals beyond the base VASP license.</w:t>
+        <w:t xml:space="preserve">Our market research confirms the thesis and sharpens it. The Nigerian market is stablecoin-shaped - USDT/USDC dominate because they hedge naira devaluation - so the product should quote and settle around stablecoins, with BTC/ETH secondary. The competitive gap is precisely your bundle: licensed exchanges (Busha, Quidax, Luno) do not do bills or gift cards; gift card apps (Cardtonic, Prestmit) do shallow crypto without licenses; and roughly 90% of volume sits with unlicensed offshore platforms whose users have no naira rails and no recourse. The battleground is trust: withdrawal reliability, proof-of-reserves, real support. The regulatory reality is that ISA 2025 makes digital assets securities, the SEC's ARIP program is the licensing path, CBN rules mean no SEC license = no bank account, and savings/E-Fund each require approvals beyond the base VASP license.</w:t>
       </w:r>
     </w:p>
     <w:p>
@@ -582,7 +582,7 @@
         <w:t xml:space="preserve">PRD v2.0</w:t>
       </w:r>
       <w:r>
-        <w:t xml:space="preserve"> — your scope, upgraded with compliance phasing, acceptance criteria and non-functional requirements</w:t>
+        <w:t xml:space="preserve"> - your scope, upgraded with compliance phasing, acceptance criteria and non-functional requirements</w:t>
       </w:r>
     </w:p>
     <w:p>
@@ -602,7 +602,7 @@
         <w:t xml:space="preserve">Market &amp; Regulatory Strategy Report</w:t>
       </w:r>
       <w:r>
-        <w:t xml:space="preserve"> — the regulatory gates, competitor teardown and monetization benchmarks behind this plan</w:t>
+        <w:t xml:space="preserve"> - the regulatory gates, competitor teardown and monetization benchmarks behind this plan</w:t>
       </w:r>
     </w:p>
     <w:p>
@@ -622,7 +622,7 @@
         <w:t xml:space="preserve">Brand Guide v2.0</w:t>
       </w:r>
       <w:r>
-        <w:t xml:space="preserve"> — canonical design tokens, typography, voice and accessibility rules</w:t>
+        <w:t xml:space="preserve"> - canonical design tokens, typography, voice and accessibility rules</w:t>
       </w:r>
     </w:p>
     <w:p>
@@ -642,7 +642,7 @@
         <w:t xml:space="preserve">Logo motion spec</w:t>
       </w:r>
       <w:r>
-        <w:t xml:space="preserve"> — animation standards for the LP monogram across app and web</w:t>
+        <w:t xml:space="preserve"> - animation standards for the LP monogram across app and web</w:t>
       </w:r>
     </w:p>
     <w:p>
@@ -662,7 +662,7 @@
         <w:t xml:space="preserve">Two interactive prototypes</w:t>
       </w:r>
       <w:r>
-        <w:t xml:space="preserve"> — the mobile app and the web admin console</w:t>
+        <w:t xml:space="preserve"> - the mobile app and the web admin console</w:t>
       </w:r>
     </w:p>
     <w:p>
@@ -681,7 +681,7 @@
         <w:br w:type="page"/>
       </w:r>
       <w:r>
-        <w:t xml:space="preserve">3. Recommended Delivery Approach — Phased Releases Aligned to Regulatory Gates</w:t>
+        <w:t xml:space="preserve">3. Recommended Delivery Approach - Phased Releases Aligned to Regulatory Gates</w:t>
       </w:r>
     </w:p>
     <w:p>
@@ -689,7 +689,7 @@
         <w:spacing w:after="160" w:before="0"/>
       </w:pPr>
       <w:r>
-        <w:t xml:space="preserve">We recommend five phases. Each phase ships a coherent, operable product increment, and each is gated on the regulatory precondition it actually needs — no feature waits on an approval it doesn't require, and no feature launches before the approval it does.</w:t>
+        <w:t xml:space="preserve">We recommend five phases. Each phase ships a coherent, operable product increment, and each is gated on the regulatory precondition it actually needs - no feature waits on an approval it doesn't require, and no feature launches before the approval it does.</w:t>
       </w:r>
     </w:p>
     <w:tbl>
@@ -1086,7 +1086,7 @@
                 <w:sz w:val="20"/>
                 <w:szCs w:val="20"/>
               </w:rPr>
-              <w:t xml:space="preserve">16–20 weeks</w:t>
+              <w:t xml:space="preserve">16-20 weeks</w:t>
             </w:r>
           </w:p>
         </w:tc>
@@ -1208,7 +1208,7 @@
                 <w:sz w:val="20"/>
                 <w:szCs w:val="20"/>
               </w:rPr>
-              <w:t xml:space="preserve">8–10 weeks</w:t>
+              <w:t xml:space="preserve">8-10 weeks</w:t>
             </w:r>
           </w:p>
         </w:tc>
@@ -1330,7 +1330,7 @@
                 <w:sz w:val="20"/>
                 <w:szCs w:val="20"/>
               </w:rPr>
-              <w:t xml:space="preserve">10–12 weeks</w:t>
+              <w:t xml:space="preserve">10-12 weeks</w:t>
             </w:r>
           </w:p>
         </w:tc>
@@ -1452,7 +1452,7 @@
                 <w:sz w:val="20"/>
                 <w:szCs w:val="20"/>
               </w:rPr>
-              <w:t xml:space="preserve">10–12 weeks</w:t>
+              <w:t xml:space="preserve">10-12 weeks</w:t>
             </w:r>
           </w:p>
         </w:tc>
@@ -1471,7 +1471,7 @@
         <w:pStyle w:val="Heading2"/>
       </w:pPr>
       <w:r>
-        <w:t xml:space="preserve">Phase 0 — Foundation &amp; Compliance Setup (6 weeks)</w:t>
+        <w:t xml:space="preserve">Phase 0 - Foundation &amp; Compliance Setup (6 weeks)</w:t>
       </w:r>
     </w:p>
     <w:p>
@@ -1563,7 +1563,7 @@
         <w:spacing w:after="80"/>
       </w:pPr>
       <w:r>
-        <w:t xml:space="preserve">Double-entry ledger core with immutable journal — the foundation for all balances, and for FIRS monthly reporting from day one.</w:t>
+        <w:t xml:space="preserve">Double-entry ledger core with immutable journal - the foundation for all balances, and for FIRS monthly reporting from day one.</w:t>
       </w:r>
     </w:p>
     <w:p>
@@ -1614,7 +1614,7 @@
         <w:pStyle w:val="Heading2"/>
       </w:pPr>
       <w:r>
-        <w:t xml:space="preserve">Phase 1 — MVP Launch (16–20 weeks)</w:t>
+        <w:t xml:space="preserve">Phase 1 - MVP Launch (16-20 weeks)</w:t>
       </w:r>
     </w:p>
     <w:p>
@@ -1781,7 +1781,7 @@
         <w:t xml:space="preserve">Bills via aggregator (VTpass): </w:t>
       </w:r>
       <w:r>
-        <w:t xml:space="preserve">airtime, data, electricity (prepaid/postpaid), TV — live validation, auto-refund on failure, receipts.</w:t>
+        <w:t xml:space="preserve">airtime, data, electricity (prepaid/postpaid), TV - live validation, auto-refund on failure, receipts.</w:t>
       </w:r>
     </w:p>
     <w:p>
@@ -1881,7 +1881,7 @@
         <w:t xml:space="preserve">Launch hardening: </w:t>
       </w:r>
       <w:r>
-        <w:t xml:space="preserve">third-party penetration test, load test, closed beta (500–1,000 users), app-store submissions.</w:t>
+        <w:t xml:space="preserve">third-party penetration test, load test, closed beta (500-1,000 users), app-store submissions.</w:t>
       </w:r>
     </w:p>
     <w:p>
@@ -1919,7 +1919,7 @@
         <w:pStyle w:val="Heading2"/>
       </w:pPr>
       <w:r>
-        <w:t xml:space="preserve">Phase 2 — Engagement &amp; Breadth (8–10 weeks)</w:t>
+        <w:t xml:space="preserve">Phase 2 - Engagement &amp; Breadth (8-10 weeks)</w:t>
       </w:r>
     </w:p>
     <w:p>
@@ -2061,7 +2061,7 @@
         <w:t xml:space="preserve">Out of scope: </w:t>
       </w:r>
       <w:r>
-        <w:t xml:space="preserve">P2P marketplace (deliberately — Quidax's P2P died in 5 months); virtual dollar cards (optional later change request).</w:t>
+        <w:t xml:space="preserve">P2P marketplace (deliberately - Quidax's P2P died in 5 months); virtual dollar cards (optional later change request).</w:t>
       </w:r>
     </w:p>
     <w:p>
@@ -2084,7 +2084,7 @@
         <w:pStyle w:val="Heading2"/>
       </w:pPr>
       <w:r>
-        <w:t xml:space="preserve">Phase 3 — Savings &amp; Spot Order Book (10–12 weeks)</w:t>
+        <w:t xml:space="preserve">Phase 3 - Savings &amp; Spot Order Book (10-12 weeks)</w:t>
       </w:r>
     </w:p>
     <w:p>
@@ -2209,7 +2209,7 @@
         <w:pStyle w:val="Heading2"/>
       </w:pPr>
       <w:r>
-        <w:t xml:space="preserve">Phase 4 — E-Fund (10–12 weeks; gated on license)</w:t>
+        <w:t xml:space="preserve">Phase 4 - E-Fund (10-12 weeks; gated on license)</w:t>
       </w:r>
     </w:p>
     <w:p>
@@ -3192,7 +3192,7 @@
         <w:t xml:space="preserve">Architecture. </w:t>
       </w:r>
       <w:r>
-        <w:t xml:space="preserve">A React Native mobile app (single codebase, iOS + Android) against a NestJS (TypeScript) API on PostgreSQL with Redis for caching, queues and rate-limiting. The web admin console is a React SPA on the same API. Services are modular monolith first, split only where load demands (quote engine, webhook ingestion) — right-sized for a lean team, not a microservices sprawl.</w:t>
+        <w:t xml:space="preserve">A React Native mobile app (single codebase, iOS + Android) against a NestJS (TypeScript) API on PostgreSQL with Redis for caching, queues and rate-limiting. The web admin console is a React SPA on the same API. Services are modular monolith first, split only where load demands (quote engine, webhook ingestion) - right-sized for a lean team, not a microservices sprawl.</w:t>
       </w:r>
     </w:p>
     <w:p>
@@ -3222,7 +3222,7 @@
         <w:t xml:space="preserve">Custody. </w:t>
       </w:r>
       <w:r>
-        <w:t xml:space="preserve">Private keys never touch our servers. Crypto custody via an MPC wallet provider — Fireblocks (industry default) or Blockradar (Nigeria-focused, strong stablecoin rails) — with a treasury policy of hot-wallet minimums, cold-storage sweep thresholds, and dual-approval withdrawal policies enforced at the custody layer.</w:t>
+        <w:t xml:space="preserve">Private keys never touch our servers. Crypto custody via an MPC wallet provider - Fireblocks (industry default) or Blockradar (Nigeria-focused, strong stablecoin rails) - with a treasury policy of hot-wallet minimums, cold-storage sweep thresholds, and dual-approval withdrawal policies enforced at the custody layer.</w:t>
       </w:r>
     </w:p>
     <w:p>
@@ -3237,7 +3237,7 @@
         <w:t xml:space="preserve">Fiat rails. </w:t>
       </w:r>
       <w:r>
-        <w:t xml:space="preserve">Naira collection via dedicated virtual accounts (Providus, 9PSB or Monnify — final selection in Phase 0), with real-time webhooks and name-match verification on payouts. We deliberately avoid card acquiring at launch: mainstream PSPs contractually exclude crypto businesses, and bank transfer is Nigeria's #1 payment channel anyway.</w:t>
+        <w:t xml:space="preserve">Naira collection via dedicated virtual accounts (Providus, 9PSB or Monnify - final selection in Phase 0), with real-time webhooks and name-match verification on payouts. We deliberately avoid card acquiring at launch: mainstream PSPs contractually exclude crypto businesses, and bank transfer is Nigeria's #1 payment channel anyway.</w:t>
       </w:r>
     </w:p>
     <w:p>
@@ -3252,7 +3252,7 @@
         <w:t xml:space="preserve">Bills. </w:t>
       </w:r>
       <w:r>
-        <w:t xml:space="preserve">VTpass as primary aggregator (Quickteller as fallback design) — airtime, data, electricity, TV with live validation and automatic refund on timeout. No CBN PSSP license needed because the aggregator holds it.</w:t>
+        <w:t xml:space="preserve">VTpass as primary aggregator (Quickteller as fallback design) - airtime, data, electricity, TV with live validation and automatic refund on timeout. No CBN PSSP license needed because the aggregator holds it.</w:t>
       </w:r>
     </w:p>
     <w:p>
@@ -3282,7 +3282,7 @@
         <w:t xml:space="preserve">Quality, monitoring and SLOs. </w:t>
       </w:r>
       <w:r>
-        <w:t xml:space="preserve">Automated test suites in CI, staging mirroring production, structured logging, metrics and alerting (uptime, withdrawal latency, webhook lag). Launch SLOs: 99.9% API availability, naira withdrawals under 5 minutes at p95, KYC Tier 1 decision under 10 minutes at p95 — measured and reported monthly.</w:t>
+        <w:t xml:space="preserve">Automated test suites in CI, staging mirroring production, structured logging, metrics and alerting (uptime, withdrawal latency, webhook lag). Launch SLOs: 99.9% API availability, naira withdrawals under 5 minutes at p95, KYC Tier 1 decision under 10 minutes at p95 - measured and reported monthly.</w:t>
       </w:r>
     </w:p>
     <w:p>
@@ -3907,7 +3907,7 @@
                 <w:sz w:val="20"/>
                 <w:szCs w:val="20"/>
               </w:rPr>
-              <w:t xml:space="preserve">Phase 0 — Foundation &amp; compliance setup</w:t>
+              <w:t xml:space="preserve">Phase 0 - Foundation &amp; compliance setup</w:t>
             </w:r>
           </w:p>
         </w:tc>
@@ -4029,7 +4029,7 @@
                 <w:sz w:val="20"/>
                 <w:szCs w:val="20"/>
               </w:rPr>
-              <w:t xml:space="preserve">Phase 1 — MVP</w:t>
+              <w:t xml:space="preserve">Phase 1 - MVP</w:t>
             </w:r>
           </w:p>
         </w:tc>
@@ -4059,7 +4059,7 @@
                 <w:sz w:val="20"/>
                 <w:szCs w:val="20"/>
               </w:rPr>
-              <w:t xml:space="preserve">16–20 weeks</w:t>
+              <w:t xml:space="preserve">16-20 weeks</w:t>
             </w:r>
           </w:p>
         </w:tc>
@@ -4089,7 +4089,7 @@
                 <w:sz w:val="20"/>
                 <w:szCs w:val="20"/>
               </w:rPr>
-              <w:t xml:space="preserve">[Month] → [Month + 4–5]</w:t>
+              <w:t xml:space="preserve">[Month] → [Month + 4-5]</w:t>
             </w:r>
           </w:p>
         </w:tc>
@@ -4119,7 +4119,7 @@
                 <w:sz w:val="20"/>
                 <w:szCs w:val="20"/>
               </w:rPr>
-              <w:t xml:space="preserve">Design freeze (wk 4); testnet demo (wk 8); code freeze + security audit (wk 13–15); closed beta (wk 15–17); public launch (wk 16–20, gated on AIP + bank account)</w:t>
+              <w:t xml:space="preserve">Design freeze (wk 4); testnet demo (wk 8); code freeze + security audit (wk 13-15); closed beta (wk 15-17); public launch (wk 16-20, gated on AIP + bank account)</w:t>
             </w:r>
           </w:p>
         </w:tc>
@@ -4151,7 +4151,7 @@
                 <w:sz w:val="20"/>
                 <w:szCs w:val="20"/>
               </w:rPr>
-              <w:t xml:space="preserve">Phase 2 — Gift cards, alerts, assets</w:t>
+              <w:t xml:space="preserve">Phase 2 - Gift cards, alerts, assets</w:t>
             </w:r>
           </w:p>
         </w:tc>
@@ -4181,7 +4181,7 @@
                 <w:sz w:val="20"/>
                 <w:szCs w:val="20"/>
               </w:rPr>
-              <w:t xml:space="preserve">8–10 weeks</w:t>
+              <w:t xml:space="preserve">8-10 weeks</w:t>
             </w:r>
           </w:p>
         </w:tc>
@@ -4241,7 +4241,7 @@
                 <w:sz w:val="20"/>
                 <w:szCs w:val="20"/>
               </w:rPr>
-              <w:t xml:space="preserve">Gift card pilot (wk 4); full rollout + cashback loop (wk 8–10)</w:t>
+              <w:t xml:space="preserve">Gift card pilot (wk 4); full rollout + cashback loop (wk 8-10)</w:t>
             </w:r>
           </w:p>
         </w:tc>
@@ -4273,7 +4273,7 @@
                 <w:sz w:val="20"/>
                 <w:szCs w:val="20"/>
               </w:rPr>
-              <w:t xml:space="preserve">Phase 3 — Savings + order book</w:t>
+              <w:t xml:space="preserve">Phase 3 - Savings + order book</w:t>
             </w:r>
           </w:p>
         </w:tc>
@@ -4303,7 +4303,7 @@
                 <w:sz w:val="20"/>
                 <w:szCs w:val="20"/>
               </w:rPr>
-              <w:t xml:space="preserve">10–12 weeks</w:t>
+              <w:t xml:space="preserve">10-12 weeks</w:t>
             </w:r>
           </w:p>
         </w:tc>
@@ -4395,7 +4395,7 @@
                 <w:sz w:val="20"/>
                 <w:szCs w:val="20"/>
               </w:rPr>
-              <w:t xml:space="preserve">Phase 4 — E-Fund</w:t>
+              <w:t xml:space="preserve">Phase 4 - E-Fund</w:t>
             </w:r>
           </w:p>
         </w:tc>
@@ -4425,7 +4425,7 @@
                 <w:sz w:val="20"/>
                 <w:szCs w:val="20"/>
               </w:rPr>
-              <w:t xml:space="preserve">10–12 weeks</w:t>
+              <w:t xml:space="preserve">10-12 weeks</w:t>
             </w:r>
           </w:p>
         </w:tc>
@@ -4455,7 +4455,7 @@
                 <w:sz w:val="20"/>
                 <w:szCs w:val="20"/>
               </w:rPr>
-              <w:t xml:space="preserve">Gated — starts on license/partnership confirmation</w:t>
+              <w:t xml:space="preserve">Gated - starts on license/partnership confirmation</w:t>
             </w:r>
           </w:p>
         </w:tc>
@@ -4589,7 +4589,7 @@
                 <w:sz w:val="20"/>
                 <w:szCs w:val="20"/>
               </w:rPr>
-              <w:t xml:space="preserve">Definition (also a payment trigger — see Section 7)</w:t>
+              <w:t xml:space="preserve">Definition (also a payment trigger - see Section 7)</w:t>
             </w:r>
           </w:p>
         </w:tc>
@@ -4837,7 +4837,7 @@
                 <w:sz w:val="20"/>
                 <w:szCs w:val="20"/>
               </w:rPr>
-              <w:t xml:space="preserve">500–1,000 real users on production infrastructure with real (limited) funds; withdrawal SLA and support process measured</w:t>
+              <w:t xml:space="preserve">500-1,000 real users on production infrastructure with real (limited) funds; withdrawal SLA and support process measured</w:t>
             </w:r>
           </w:p>
         </w:tc>
@@ -4922,10 +4922,10 @@
           <w:b/>
           <w:bCs/>
         </w:rPr>
-        <w:t xml:space="preserve">Realistic total to MVP launch: approximately 22–26 weeks from Phase 0 kick-off (Phase 1 itself 16–20 weeks). </w:t>
-      </w:r>
-      <w:r>
-        <w:t xml:space="preserve">Phases 2–4 add roughly 28–34 further build weeks, with Phase 3 and Phase 4 go-lives dependent on Client-side regulatory milestones. We flag now, honestly: the SEC's observed pace is 9–18 months to AIP — engineering will likely be ready before the license is. The phasing above turns that wait into Phase 2 build time rather than idle burn.</w:t>
+        <w:t xml:space="preserve">Realistic total to MVP launch: approximately 22-26 weeks from Phase 0 kick-off (Phase 1 itself 16-20 weeks). </w:t>
+      </w:r>
+      <w:r>
+        <w:t xml:space="preserve">Phases 2-4 add roughly 28-34 further build weeks, with Phase 3 and Phase 4 go-lives dependent on Client-side regulatory milestones. We flag now, honestly: the SEC's observed pace is 9-18 months to AIP - engineering will likely be ready before the license is. The phasing above turns that wait into Phase 2 build time rather than idle burn.</w:t>
       </w:r>
     </w:p>
     <w:p>
@@ -6677,7 +6677,7 @@
                 <w:sz w:val="20"/>
                 <w:szCs w:val="20"/>
               </w:rPr>
-              <w:t xml:space="preserve">Phase 0 — Foundation &amp; compliance setup</w:t>
+              <w:t xml:space="preserve">Phase 0 - Foundation &amp; compliance setup</w:t>
             </w:r>
           </w:p>
         </w:tc>
@@ -6769,7 +6769,7 @@
                 <w:sz w:val="20"/>
                 <w:szCs w:val="20"/>
               </w:rPr>
-              <w:t xml:space="preserve">Phase 1 — MVP</w:t>
+              <w:t xml:space="preserve">Phase 1 - MVP</w:t>
             </w:r>
           </w:p>
         </w:tc>
@@ -6861,7 +6861,7 @@
                 <w:sz w:val="20"/>
                 <w:szCs w:val="20"/>
               </w:rPr>
-              <w:t xml:space="preserve">Phase 2 — Gift cards &amp; engagement</w:t>
+              <w:t xml:space="preserve">Phase 2 - Gift cards &amp; engagement</w:t>
             </w:r>
           </w:p>
         </w:tc>
@@ -6953,7 +6953,7 @@
                 <w:sz w:val="20"/>
                 <w:szCs w:val="20"/>
               </w:rPr>
-              <w:t xml:space="preserve">Phase 3 — Savings + order book</w:t>
+              <w:t xml:space="preserve">Phase 3 - Savings + order book</w:t>
             </w:r>
           </w:p>
         </w:tc>
@@ -7045,7 +7045,7 @@
                 <w:sz w:val="20"/>
                 <w:szCs w:val="20"/>
               </w:rPr>
-              <w:t xml:space="preserve">Phase 4 — E-Fund</w:t>
+              <w:t xml:space="preserve">Phase 4 - E-Fund</w:t>
             </w:r>
           </w:p>
         </w:tc>
@@ -7131,7 +7131,7 @@
         <w:t xml:space="preserve">Suggested structure: </w:t>
       </w:r>
       <w:r>
-        <w:t xml:space="preserve">30% of each phase upfront, remainder milestone-based as above. Each phase is separately commissioned — the Client may pause after any phase with no penalty beyond work in progress.</w:t>
+        <w:t xml:space="preserve">30% of each phase upfront, remainder milestone-based as above. Each phase is separately commissioned - the Client may pause after any phase with no penalty beyond work in progress.</w:t>
       </w:r>
     </w:p>
     <w:p>
@@ -7146,7 +7146,7 @@
         <w:t xml:space="preserve">Billed monthly at cost (pass-through, in the Client's name where possible): </w:t>
       </w:r>
       <w:r>
-        <w:t xml:space="preserve">cloud infrastructure and monitoring; custody provider fees (typically platform fee + per-transaction); KYC checks (market rate roughly $0.10–0.50 per check depending on type and volume); SMS/email delivery; app-store fees; market-data feeds. We will provide a monthly infrastructure cost forecast at Phase 0 exit.</w:t>
+        <w:t xml:space="preserve">cloud infrastructure and monitoring; custody provider fees (typically platform fee + per-transaction); KYC checks (market rate roughly $0.10-0.50 per check depending on type and volume); SMS/email delivery; app-store fees; market-data feeds. We will provide a monthly infrastructure cost forecast at Phase 0 exit.</w:t>
       </w:r>
     </w:p>
     <w:p>
@@ -7223,7 +7223,7 @@
         <w:spacing w:after="80"/>
       </w:pPr>
       <w:r>
-        <w:t xml:space="preserve">The Client provides (or contracts) the licensed operating entity: Nigerian incorporation, physical office, resident CEO/MD, four fit-and-proper principal officers — or a partnership/acquisition arrangement with an existing AIP holder.</w:t>
+        <w:t xml:space="preserve">The Client provides (or contracts) the licensed operating entity: Nigerian incorporation, physical office, resident CEO/MD, four fit-and-proper principal officers - or a partnership/acquisition arrangement with an existing AIP holder.</w:t>
       </w:r>
     </w:p>
     <w:p>
@@ -7275,7 +7275,7 @@
         <w:spacing w:after="80"/>
       </w:pPr>
       <w:r>
-        <w:t xml:space="preserve">Marketing content, terms of service, risk disclosures and all user-facing legal copy are reviewed and approved by the Client's counsel before release — particularly savings and E-Fund language under ISA 2025's anti-Ponzi provisions.</w:t>
+        <w:t xml:space="preserve">Marketing content, terms of service, risk disclosures and all user-facing legal copy are reviewed and approved by the Client's counsel before release - particularly savings and E-Fund language under ISA 2025's anti-Ponzi provisions.</w:t>
       </w:r>
     </w:p>
     <w:p>
@@ -7359,7 +7359,7 @@
         <w:spacing w:after="160" w:before="0"/>
       </w:pPr>
       <w:r>
-        <w:t xml:space="preserve">A crypto exchange in Nigeria fails for predictable reasons — Patricia, FTX and CBEX are the case studies. We manage each risk explicitly, and the risk log is a standing item in the weekly Client report.</w:t>
+        <w:t xml:space="preserve">A crypto exchange in Nigeria fails for predictable reasons - Patricia, FTX and CBEX are the case studies. We manage each risk explicitly, and the risk log is a standing item in the weekly Client report.</w:t>
       </w:r>
     </w:p>
     <w:tbl>
@@ -7570,7 +7570,7 @@
                 <w:sz w:val="20"/>
                 <w:szCs w:val="20"/>
               </w:rPr>
-              <w:t xml:space="preserve">Phase gates isolate exposure — no feature is built ahead of its legal basis; compliance rules (limits, tiers, reporting) are configuration, not code; quarterly regulatory-watch review with Client's counsel baked into the plan</w:t>
+              <w:t xml:space="preserve">Phase gates isolate exposure - no feature is built ahead of its legal basis; compliance rules (limits, tiers, reporting) are configuration, not code; quarterly regulatory-watch review with Client's counsel baked into the plan</w:t>
             </w:r>
           </w:p>
         </w:tc>
@@ -7602,7 +7602,7 @@
                 <w:sz w:val="20"/>
                 <w:szCs w:val="20"/>
               </w:rPr>
-              <w:t xml:space="preserve">Licensing slower than build (9–18 months to AIP observed)</w:t>
+              <w:t xml:space="preserve">Licensing slower than build (9-18 months to AIP observed)</w:t>
             </w:r>
           </w:p>
         </w:tc>
@@ -7632,7 +7632,7 @@
                 <w:sz w:val="20"/>
                 <w:szCs w:val="20"/>
               </w:rPr>
-              <w:t xml:space="preserve">Medium–High</w:t>
+              <w:t xml:space="preserve">Medium-High</w:t>
             </w:r>
           </w:p>
         </w:tc>
@@ -8338,7 +8338,7 @@
         <w:t xml:space="preserve">30 days</w:t>
       </w:r>
       <w:r>
-        <w:t xml:space="preserve"> from the date on the cover. Signature below commissions Phase 0 and establishes the phase-gate framework for Phases 1–4; each subsequent phase is commissioned by a one-page phase order referencing this SOW.</w:t>
+        <w:t xml:space="preserve"> from the date on the cover. Signature below commissions Phase 0 and establishes the phase-gate framework for Phases 1-4; each subsequent phase is commissioned by a one-page phase order referencing this SOW.</w:t>
       </w:r>
     </w:p>
     <w:p>
@@ -8358,7 +8358,7 @@
           <w:b/>
           <w:bCs/>
         </w:rPr>
-        <w:t xml:space="preserve">For the Client — Oshodi-Tapa Agboola</w:t>
+        <w:t xml:space="preserve">For the Client - Oshodi-Tapa Agboola</w:t>
       </w:r>
     </w:p>
     <w:p>
@@ -8394,7 +8394,7 @@
           <w:b/>
           <w:bCs/>
         </w:rPr>
-        <w:t xml:space="preserve">For the Developer — [Developer Name/Studio]</w:t>
+        <w:t xml:space="preserve">For the Developer - [Developer Name/Studio]</w:t>
       </w:r>
     </w:p>
     <w:p>
@@ -8500,7 +8500,7 @@
         <w:sz w:val="16"/>
         <w:szCs w:val="16"/>
       </w:rPr>
-      <w:t xml:space="preserve">Confidential — Lentopay Exchange Proposal &amp; SOW v1.0    |    Page </w:t>
+      <w:t xml:space="preserve">Confidential - Lentopay Exchange Proposal &amp; SOW v1.0    |    Page </w:t>
     </w:r>
     <w:r>
       <w:rPr>

</xml_diff>

<commit_message>
Add Dexter Cyberlab attribution (prepared by, 2026, www.dextercyberlab.com) to all documents and site footer
Co-Authored-By: Claude Fable 5 <noreply@anthropic.com>
</commit_message>
<xml_diff>
--- a/downloads/Lentopay-Development-Proposal-SOW.docx
+++ b/downloads/Lentopay-Development-Proposal-SOW.docx
@@ -85,7 +85,7 @@
         <w:t xml:space="preserve">Prepared by: </w:t>
       </w:r>
       <w:r>
-        <w:t xml:space="preserve">[Developer Name/Studio]</w:t>
+        <w:t xml:space="preserve">Dexter Cyberlab · 2026 · www.dextercyberlab.com</w:t>
       </w:r>
     </w:p>
     <w:p>
@@ -362,7 +362,7 @@
                 <w:sz w:val="20"/>
                 <w:szCs w:val="20"/>
               </w:rPr>
-              <w:t xml:space="preserve">[Developer Name/Studio]</w:t>
+              <w:t xml:space="preserve">Dexter Cyberlab</w:t>
             </w:r>
           </w:p>
         </w:tc>
@@ -527,7 +527,7 @@
           <w:b/>
           <w:bCs/>
         </w:rPr>
-        <w:t xml:space="preserve">[Developer Name/Studio]</w:t>
+        <w:t xml:space="preserve">Dexter Cyberlab</w:t>
       </w:r>
     </w:p>
     <w:p>
@@ -8394,7 +8394,7 @@
           <w:b/>
           <w:bCs/>
         </w:rPr>
-        <w:t xml:space="preserve">For the Developer - [Developer Name/Studio]</w:t>
+        <w:t xml:space="preserve">For the Developer - Dexter Cyberlab</w:t>
       </w:r>
     </w:p>
     <w:p>
@@ -8433,7 +8433,7 @@
           <w:sz w:val="18"/>
           <w:szCs w:val="18"/>
         </w:rPr>
-        <w:t xml:space="preserve">Confidential. Prepared by [Developer Name/Studio] for Oshodi-Tapa Agboola. © 2026. Regulatory and market figures derive from the accompanying Market &amp; Regulatory Strategy Report and should be re-verified with counsel before filings.</w:t>
+        <w:t xml:space="preserve">Confidential. Prepared by Dexter Cyberlab (www.dextercyberlab.com) for Oshodi-Tapa Agboola. © 2026. Regulatory and market figures derive from the accompanying Market &amp; Regulatory Strategy Report and should be re-verified with counsel before filings.</w:t>
       </w:r>
     </w:p>
     <w:sectPr>

</xml_diff>